<commit_message>
Enrich Hunter Morris's biography, integrate File 17 Government Outreach Plan, and add Westervelt to competitor profiles
</commit_message>
<xml_diff>
--- a/01_Executive_Summary_&_Business_Plan.docx
+++ b/01_Executive_Summary_&_Business_Plan.docx
@@ -790,7 +790,7 @@
         <w:t>Hadi Irvani (Co-Founder &amp; Board Member)</w:t>
       </w:r>
       <w:r>
-        <w:t>: General Partner at Infill Capital Partners, Principal at Granite Holdings, University of Virginia (UVA). Leading Southeast real estate and logistics asset investor, providing corporate governance, capital structuring, and developer relationship management.</w:t>
+        <w:t>: General Partner at Infill Capital Partners, Principal at Granite Holdings, University of Virginia (UVA). A leading Southeast real estate and logistics asset investor who provides corporate governance, capital structuring, and developer relationship management across major logistics corridors.</w:t>
       </w:r>
     </w:p>
     <w:p>
@@ -803,10 +803,10 @@
         <w:rPr>
           <w:b/>
         </w:rPr>
-        <w:t>Hunter (Founder &amp; Managing Director)</w:t>
+        <w:t>Hunter Morris (Founder &amp; Managing Director)</w:t>
       </w:r>
       <w:r>
-        <w:t>: Fluvial geomorphologist, Principal at Fly Fishing Georgia North Mountains. Directs all design-build instream engineering, biological monitoring, local landowner relations, and field operations.</w:t>
+        <w:t>: Fluvial geomorphologist, Principal and Owner of *Fly Fishing North Georgia* (bookings@flyfishingnorthgeorgia.com). For over 15 years, Hunter has guided trophy fly-fishing excursions across pristine wild trout streams in Fannin and Gilmer counties. His deep daily observations of mountain stream siltation and lateral bank erosion led him to study advanced fluvial dynamics. As our geomorphic design-build lead, Hunter combines intimate hydraulic knowledge of streams with Natural Channel Design (NCD) and live soil bioengineering to deliver self-sustaining trout sanctuaries.</w:t>
       </w:r>
     </w:p>
     <w:p>

</xml_diff>